<commit_message>
update instructions and template
</commit_message>
<xml_diff>
--- a/activities/week09/site-plan-template.docx
+++ b/activities/week09/site-plan-template.docx
@@ -5,7 +5,6 @@
     <w:p>
       <w:pPr>
         <w:pStyle w:val="Heading1"/>
-        <w:jc w:val="center"/>
         <w:rPr>
           <w:rFonts w:eastAsia="Times New Roman"/>
         </w:rPr>
@@ -20,7 +19,6 @@
     <w:p>
       <w:pPr>
         <w:pStyle w:val="Heading2"/>
-        <w:jc w:val="center"/>
         <w:rPr>
           <w:rFonts w:eastAsia="Times New Roman"/>
         </w:rPr>
@@ -35,7 +33,6 @@
     <w:p>
       <w:pPr>
         <w:pStyle w:val="Heading2"/>
-        <w:jc w:val="center"/>
         <w:rPr>
           <w:rFonts w:eastAsia="Times New Roman"/>
         </w:rPr>
@@ -49,7 +46,6 @@
     </w:p>
     <w:p>
       <w:pPr>
-        <w:jc w:val="center"/>
         <w:rPr>
           <w:rFonts w:eastAsia="Times New Roman"/>
         </w:rPr>
@@ -60,14 +56,13 @@
           <w:noProof/>
         </w:rPr>
         <w:pict w14:anchorId="75FCC9A1">
-          <v:rect id="_x0000_i1029" alt="" style="width:468pt;height:.05pt;mso-width-percent:0;mso-height-percent:0;mso-width-percent:0;mso-height-percent:0" o:hralign="center" o:hrstd="t" o:hr="t" fillcolor="#a0a0a0" stroked="f"/>
+          <v:rect id="_x0000_i1025" alt="" style="width:468pt;height:.05pt;mso-width-percent:0;mso-height-percent:0;mso-width-percent:0;mso-height-percent:0" o:hrstd="t" o:hr="t" fillcolor="#a0a0a0" stroked="f"/>
         </w:pict>
       </w:r>
     </w:p>
     <w:p>
       <w:pPr>
         <w:pStyle w:val="Heading2"/>
-        <w:jc w:val="center"/>
         <w:rPr>
           <w:rFonts w:eastAsia="Times New Roman"/>
         </w:rPr>
@@ -82,7 +77,6 @@
     <w:p>
       <w:pPr>
         <w:pStyle w:val="Heading3"/>
-        <w:jc w:val="center"/>
         <w:rPr>
           <w:rFonts w:eastAsia="Times New Roman"/>
         </w:rPr>
@@ -97,7 +91,6 @@
     <w:p>
       <w:pPr>
         <w:pStyle w:val="NormalWeb"/>
-        <w:jc w:val="center"/>
       </w:pPr>
       <w:r>
         <w:t>[Your purpose here]</w:t>
@@ -106,7 +99,6 @@
     <w:p>
       <w:pPr>
         <w:pStyle w:val="Heading3"/>
-        <w:jc w:val="center"/>
         <w:rPr>
           <w:rFonts w:eastAsia="Times New Roman"/>
         </w:rPr>
@@ -121,7 +113,6 @@
     <w:p>
       <w:pPr>
         <w:pStyle w:val="NormalWeb"/>
-        <w:jc w:val="center"/>
       </w:pPr>
       <w:r>
         <w:t>[Your audience here]</w:t>
@@ -129,7 +120,6 @@
     </w:p>
     <w:p>
       <w:pPr>
-        <w:jc w:val="center"/>
         <w:rPr>
           <w:rFonts w:eastAsia="Times New Roman"/>
         </w:rPr>
@@ -140,14 +130,13 @@
           <w:noProof/>
         </w:rPr>
         <w:pict w14:anchorId="353FE91A">
-          <v:rect id="_x0000_i1028" alt="" style="width:468pt;height:.05pt;mso-width-percent:0;mso-height-percent:0;mso-width-percent:0;mso-height-percent:0" o:hralign="center" o:hrstd="t" o:hr="t" fillcolor="#a0a0a0" stroked="f"/>
+          <v:rect id="_x0000_i1026" alt="" style="width:468pt;height:.05pt;mso-width-percent:0;mso-height-percent:0;mso-width-percent:0;mso-height-percent:0" o:hrstd="t" o:hr="t" fillcolor="#a0a0a0" stroked="f"/>
         </w:pict>
       </w:r>
     </w:p>
     <w:p>
       <w:pPr>
         <w:pStyle w:val="Heading2"/>
-        <w:jc w:val="center"/>
         <w:rPr>
           <w:rFonts w:eastAsia="Times New Roman"/>
         </w:rPr>
@@ -162,7 +151,6 @@
     <w:p>
       <w:pPr>
         <w:pStyle w:val="Heading3"/>
-        <w:jc w:val="center"/>
         <w:rPr>
           <w:rFonts w:eastAsia="Times New Roman"/>
         </w:rPr>
@@ -176,7 +164,6 @@
     </w:p>
     <w:p>
       <w:pPr>
-        <w:jc w:val="center"/>
         <w:rPr>
           <w:rFonts w:eastAsia="Times New Roman"/>
         </w:rPr>
@@ -225,23 +212,20 @@
     </w:p>
     <w:p>
       <w:pPr>
-        <w:jc w:val="center"/>
-        <w:rPr>
-          <w:rFonts w:eastAsia="Times New Roman"/>
-        </w:rPr>
-      </w:pPr>
-    </w:p>
-    <w:p>
-      <w:pPr>
-        <w:jc w:val="center"/>
-        <w:rPr>
-          <w:rFonts w:eastAsia="Times New Roman"/>
-        </w:rPr>
-      </w:pPr>
-    </w:p>
-    <w:p>
-      <w:pPr>
-        <w:jc w:val="center"/>
+        <w:rPr>
+          <w:rFonts w:eastAsia="Times New Roman"/>
+        </w:rPr>
+      </w:pPr>
+    </w:p>
+    <w:p>
+      <w:pPr>
+        <w:rPr>
+          <w:rFonts w:eastAsia="Times New Roman"/>
+        </w:rPr>
+      </w:pPr>
+    </w:p>
+    <w:p>
+      <w:pPr>
         <w:rPr>
           <w:rFonts w:eastAsia="Times New Roman"/>
         </w:rPr>
@@ -252,14 +236,13 @@
           <w:noProof/>
         </w:rPr>
         <w:pict w14:anchorId="7CF0E329">
-          <v:rect id="_x0000_i1027" alt="" style="width:468pt;height:.05pt;mso-width-percent:0;mso-height-percent:0;mso-width-percent:0;mso-height-percent:0" o:hralign="center" o:hrstd="t" o:hr="t" fillcolor="#a0a0a0" stroked="f"/>
+          <v:rect id="_x0000_i1027" alt="" style="width:468pt;height:.05pt;mso-width-percent:0;mso-height-percent:0;mso-width-percent:0;mso-height-percent:0" o:hrstd="t" o:hr="t" fillcolor="#a0a0a0" stroked="f"/>
         </w:pict>
       </w:r>
     </w:p>
     <w:p>
       <w:pPr>
         <w:pStyle w:val="Heading2"/>
-        <w:jc w:val="center"/>
         <w:rPr>
           <w:rFonts w:eastAsia="Times New Roman"/>
         </w:rPr>
@@ -274,7 +257,6 @@
     <w:p>
       <w:pPr>
         <w:pStyle w:val="Heading3"/>
-        <w:jc w:val="center"/>
         <w:rPr>
           <w:rFonts w:eastAsia="Times New Roman"/>
         </w:rPr>
@@ -325,7 +307,6 @@
           </w:tcPr>
           <w:p>
             <w:pPr>
-              <w:jc w:val="center"/>
               <w:rPr>
                 <w:rFonts w:eastAsia="Times New Roman"/>
                 <w:b/>
@@ -350,7 +331,6 @@
           </w:tcPr>
           <w:p>
             <w:pPr>
-              <w:jc w:val="center"/>
               <w:rPr>
                 <w:rFonts w:eastAsia="Times New Roman"/>
                 <w:b/>
@@ -375,7 +355,6 @@
           </w:tcPr>
           <w:p>
             <w:pPr>
-              <w:jc w:val="center"/>
               <w:rPr>
                 <w:rFonts w:eastAsia="Times New Roman"/>
                 <w:b/>
@@ -400,7 +379,6 @@
           </w:tcPr>
           <w:p>
             <w:pPr>
-              <w:jc w:val="center"/>
               <w:rPr>
                 <w:rFonts w:eastAsia="Times New Roman"/>
                 <w:b/>
@@ -430,7 +408,6 @@
           </w:tcPr>
           <w:p>
             <w:pPr>
-              <w:jc w:val="center"/>
               <w:rPr>
                 <w:rFonts w:eastAsia="Times New Roman"/>
                 <w:sz w:val="20"/>
@@ -455,7 +432,6 @@
           </w:tcPr>
           <w:p>
             <w:pPr>
-              <w:jc w:val="center"/>
               <w:rPr>
                 <w:rFonts w:eastAsia="Times New Roman"/>
                 <w:sz w:val="20"/>
@@ -480,7 +456,6 @@
           </w:tcPr>
           <w:p>
             <w:pPr>
-              <w:jc w:val="center"/>
               <w:rPr>
                 <w:rFonts w:eastAsia="Times New Roman"/>
                 <w:sz w:val="20"/>
@@ -505,7 +480,6 @@
           </w:tcPr>
           <w:p>
             <w:pPr>
-              <w:jc w:val="center"/>
               <w:rPr>
                 <w:rFonts w:eastAsia="Times New Roman"/>
                 <w:sz w:val="20"/>
@@ -538,7 +512,6 @@
     <w:p>
       <w:pPr>
         <w:pStyle w:val="Heading3"/>
-        <w:jc w:val="center"/>
         <w:rPr>
           <w:rFonts w:eastAsia="Times New Roman"/>
           <w:sz w:val="32"/>
@@ -558,7 +531,6 @@
     <w:p>
       <w:pPr>
         <w:pStyle w:val="Heading4"/>
-        <w:jc w:val="center"/>
         <w:rPr>
           <w:rFonts w:eastAsia="Times New Roman"/>
         </w:rPr>
@@ -573,7 +545,6 @@
     <w:p>
       <w:pPr>
         <w:pStyle w:val="Heading4"/>
-        <w:jc w:val="center"/>
         <w:rPr>
           <w:rFonts w:eastAsia="Times New Roman"/>
         </w:rPr>
@@ -588,7 +559,6 @@
     <w:p>
       <w:pPr>
         <w:pStyle w:val="Heading3"/>
-        <w:jc w:val="center"/>
         <w:rPr>
           <w:rFonts w:eastAsia="Times New Roman"/>
         </w:rPr>
@@ -599,23 +569,13 @@
           <w:noProof/>
         </w:rPr>
         <w:pict w14:anchorId="5E8E6CE7">
-          <v:rect id="_x0000_i1026" alt="" style="width:468pt;height:.05pt;mso-width-percent:0;mso-height-percent:0;mso-width-percent:0;mso-height-percent:0" o:hralign="center" o:hrstd="t" o:hr="t" fillcolor="#a0a0a0" stroked="f"/>
+          <v:rect id="_x0000_i1028" alt="" style="width:468pt;height:.05pt;mso-width-percent:0;mso-height-percent:0;mso-width-percent:0;mso-height-percent:0" o:hrstd="t" o:hr="t" fillcolor="#a0a0a0" stroked="f"/>
         </w:pict>
       </w:r>
     </w:p>
     <w:p>
       <w:pPr>
         <w:pStyle w:val="Heading3"/>
-        <w:jc w:val="center"/>
-        <w:rPr>
-          <w:rFonts w:eastAsia="Times New Roman"/>
-        </w:rPr>
-      </w:pPr>
-    </w:p>
-    <w:p>
-      <w:pPr>
-        <w:pStyle w:val="Heading3"/>
-        <w:jc w:val="center"/>
         <w:rPr>
           <w:rFonts w:eastAsia="Times New Roman"/>
           <w:sz w:val="32"/>
@@ -632,9 +592,6 @@
       </w:r>
     </w:p>
     <w:p>
-      <w:pPr>
-        <w:jc w:val="center"/>
-      </w:pPr>
       <w:hyperlink w:history="1">
         <w:r>
           <w:rPr>
@@ -674,7 +631,6 @@
     </w:p>
     <w:p>
       <w:pPr>
-        <w:jc w:val="center"/>
         <w:rPr>
           <w:rFonts w:eastAsia="Times New Roman"/>
         </w:rPr>
@@ -685,29 +641,26 @@
           <w:noProof/>
         </w:rPr>
         <w:pict w14:anchorId="167B79FD">
-          <v:rect id="_x0000_i1025" alt="" style="width:468pt;height:.05pt;mso-width-percent:0;mso-height-percent:0;mso-width-percent:0;mso-height-percent:0" o:hralign="center" o:hrstd="t" o:hr="t" fillcolor="#a0a0a0" stroked="f"/>
+          <v:rect id="_x0000_i1029" alt="" style="width:468pt;height:.05pt;mso-width-percent:0;mso-height-percent:0;mso-width-percent:0;mso-height-percent:0" o:hrstd="t" o:hr="t" fillcolor="#a0a0a0" stroked="f"/>
         </w:pict>
       </w:r>
     </w:p>
     <w:p>
       <w:pPr>
-        <w:jc w:val="center"/>
-        <w:rPr>
-          <w:rFonts w:eastAsia="Times New Roman"/>
-        </w:rPr>
-      </w:pPr>
-    </w:p>
-    <w:p>
-      <w:pPr>
-        <w:jc w:val="center"/>
-        <w:rPr>
-          <w:rFonts w:eastAsia="Times New Roman"/>
-        </w:rPr>
-      </w:pPr>
-    </w:p>
-    <w:p>
-      <w:pPr>
-        <w:jc w:val="center"/>
+        <w:rPr>
+          <w:rFonts w:eastAsia="Times New Roman"/>
+        </w:rPr>
+      </w:pPr>
+    </w:p>
+    <w:p>
+      <w:pPr>
+        <w:rPr>
+          <w:rFonts w:eastAsia="Times New Roman"/>
+        </w:rPr>
+      </w:pPr>
+    </w:p>
+    <w:p>
+      <w:pPr>
         <w:rPr>
           <w:rFonts w:eastAsia="Times New Roman"/>
           <w:b/>
@@ -729,15 +682,13 @@
     </w:p>
     <w:p>
       <w:pPr>
-        <w:jc w:val="center"/>
-        <w:rPr>
-          <w:rFonts w:eastAsia="Times New Roman"/>
-        </w:rPr>
-      </w:pPr>
-    </w:p>
-    <w:p>
-      <w:pPr>
-        <w:jc w:val="center"/>
+        <w:rPr>
+          <w:rFonts w:eastAsia="Times New Roman"/>
+        </w:rPr>
+      </w:pPr>
+    </w:p>
+    <w:p>
+      <w:pPr>
         <w:rPr>
           <w:rFonts w:eastAsia="Times New Roman"/>
         </w:rPr>
@@ -748,6 +699,159 @@
         </w:rPr>
         <w:t>[put all content for the pages here, including written text and images]</w:t>
       </w:r>
+    </w:p>
+    <w:p>
+      <w:pPr>
+        <w:rPr>
+          <w:rFonts w:eastAsia="Times New Roman"/>
+        </w:rPr>
+      </w:pPr>
+    </w:p>
+    <w:p>
+      <w:pPr>
+        <w:pStyle w:val="Heading3"/>
+        <w:rPr>
+          <w:rFonts w:eastAsia="Times New Roman"/>
+        </w:rPr>
+      </w:pPr>
+      <w:r>
+        <w:rPr>
+          <w:rFonts w:eastAsia="Times New Roman"/>
+        </w:rPr>
+        <w:t>Home</w:t>
+      </w:r>
+    </w:p>
+    <w:p>
+      <w:pPr>
+        <w:rPr>
+          <w:rFonts w:eastAsia="Times New Roman"/>
+        </w:rPr>
+      </w:pPr>
+      <w:r>
+        <w:rPr>
+          <w:rFonts w:eastAsia="Times New Roman"/>
+        </w:rPr>
+        <w:t>[home page content and images here]</w:t>
+      </w:r>
+    </w:p>
+    <w:p>
+      <w:pPr>
+        <w:rPr>
+          <w:rFonts w:eastAsia="Times New Roman"/>
+        </w:rPr>
+      </w:pPr>
+    </w:p>
+    <w:p>
+      <w:pPr>
+        <w:rPr>
+          <w:rFonts w:eastAsia="Times New Roman"/>
+        </w:rPr>
+      </w:pPr>
+    </w:p>
+    <w:p>
+      <w:pPr>
+        <w:rPr>
+          <w:rFonts w:eastAsia="Times New Roman"/>
+        </w:rPr>
+      </w:pPr>
+    </w:p>
+    <w:p>
+      <w:pPr>
+        <w:pStyle w:val="Heading3"/>
+        <w:rPr>
+          <w:rFonts w:eastAsia="Times New Roman"/>
+        </w:rPr>
+      </w:pPr>
+      <w:r>
+        <w:rPr>
+          <w:rFonts w:eastAsia="Times New Roman"/>
+        </w:rPr>
+        <w:t>Page 1</w:t>
+      </w:r>
+    </w:p>
+    <w:p>
+      <w:pPr>
+        <w:rPr>
+          <w:rFonts w:eastAsia="Times New Roman"/>
+        </w:rPr>
+      </w:pPr>
+      <w:r>
+        <w:rPr>
+          <w:rFonts w:eastAsia="Times New Roman"/>
+        </w:rPr>
+        <w:t>[page 1 content and images here]</w:t>
+      </w:r>
+    </w:p>
+    <w:p>
+      <w:pPr>
+        <w:rPr>
+          <w:rFonts w:eastAsia="Times New Roman"/>
+        </w:rPr>
+      </w:pPr>
+    </w:p>
+    <w:p>
+      <w:pPr>
+        <w:rPr>
+          <w:rFonts w:eastAsia="Times New Roman"/>
+        </w:rPr>
+      </w:pPr>
+    </w:p>
+    <w:p>
+      <w:pPr>
+        <w:rPr>
+          <w:rFonts w:eastAsia="Times New Roman"/>
+        </w:rPr>
+      </w:pPr>
+    </w:p>
+    <w:p>
+      <w:pPr>
+        <w:pStyle w:val="Heading3"/>
+        <w:rPr>
+          <w:rFonts w:eastAsia="Times New Roman"/>
+        </w:rPr>
+      </w:pPr>
+      <w:r>
+        <w:rPr>
+          <w:rFonts w:eastAsia="Times New Roman"/>
+        </w:rPr>
+        <w:t>Page 2</w:t>
+      </w:r>
+    </w:p>
+    <w:p>
+      <w:pPr>
+        <w:rPr>
+          <w:rFonts w:eastAsia="Times New Roman"/>
+        </w:rPr>
+      </w:pPr>
+      <w:r>
+        <w:rPr>
+          <w:rFonts w:eastAsia="Times New Roman"/>
+        </w:rPr>
+        <w:t>[page 2 content and images here]</w:t>
+      </w:r>
+    </w:p>
+    <w:p>
+      <w:pPr>
+        <w:rPr>
+          <w:rFonts w:eastAsia="Times New Roman"/>
+        </w:rPr>
+      </w:pPr>
+    </w:p>
+    <w:p>
+      <w:pPr>
+        <w:pStyle w:val="Heading3"/>
+        <w:rPr>
+          <w:rFonts w:eastAsia="Times New Roman"/>
+        </w:rPr>
+      </w:pPr>
+    </w:p>
+    <w:p>
+      <w:pPr>
+        <w:pStyle w:val="Heading3"/>
+        <w:rPr>
+          <w:rFonts w:eastAsia="Times New Roman"/>
+        </w:rPr>
+      </w:pPr>
     </w:p>
     <w:p>
       <w:pPr>
@@ -783,7 +887,6 @@
     </w:p>
     <w:p>
       <w:pPr>
-        <w:jc w:val="center"/>
         <w:rPr>
           <w:rFonts w:eastAsia="Times New Roman"/>
           <w:b/>
@@ -816,7 +919,6 @@
     <w:p>
       <w:pPr>
         <w:pStyle w:val="Heading3"/>
-        <w:jc w:val="center"/>
         <w:rPr>
           <w:rFonts w:eastAsia="Times New Roman"/>
         </w:rPr>
@@ -827,10 +929,37 @@
         </w:rPr>
         <w:t>Home</w:t>
       </w:r>
-    </w:p>
-    <w:p>
-      <w:pPr>
-        <w:jc w:val="center"/>
+      <w:r>
+        <w:rPr>
+          <w:rFonts w:eastAsia="Times New Roman"/>
+        </w:rPr>
+        <w:t xml:space="preserve"> Page Wireframe</w:t>
+      </w:r>
+    </w:p>
+    <w:p>
+      <w:pPr>
+        <w:pStyle w:val="Heading3"/>
+        <w:rPr>
+          <w:rFonts w:eastAsia="Times New Roman"/>
+          <w:b w:val="0"/>
+          <w:bCs w:val="0"/>
+          <w:i/>
+          <w:iCs/>
+        </w:rPr>
+      </w:pPr>
+      <w:r>
+        <w:rPr>
+          <w:rFonts w:eastAsia="Times New Roman"/>
+          <w:b w:val="0"/>
+          <w:bCs w:val="0"/>
+          <w:i/>
+          <w:iCs/>
+        </w:rPr>
+        <w:t>Example:</w:t>
+      </w:r>
+    </w:p>
+    <w:p>
+      <w:pPr>
         <w:rPr>
           <w:rFonts w:eastAsia="Times New Roman"/>
         </w:rPr>
@@ -841,9 +970,9 @@
           <w:noProof/>
         </w:rPr>
         <w:drawing>
-          <wp:inline distT="0" distB="0" distL="0" distR="0" wp14:anchorId="27B26B76" wp14:editId="227900FB">
-            <wp:extent cx="2478013" cy="4584324"/>
-            <wp:effectExtent l="0" t="0" r="0" b="635"/>
+          <wp:inline distT="0" distB="0" distL="0" distR="0" wp14:anchorId="27B26B76" wp14:editId="4562C315">
+            <wp:extent cx="3445132" cy="6373495"/>
+            <wp:effectExtent l="0" t="0" r="3175" b="8255"/>
             <wp:docPr id="7" name="Picture 7" descr="home page wireframe"/>
             <wp:cNvGraphicFramePr>
               <a:graphicFrameLocks xmlns:a="http://schemas.openxmlformats.org/drawingml/2006/main" noChangeAspect="1"/>
@@ -873,7 +1002,7 @@
                   <pic:spPr bwMode="auto">
                     <a:xfrm>
                       <a:off x="0" y="0"/>
-                      <a:ext cx="2523200" cy="4667921"/>
+                      <a:ext cx="3517593" cy="6507549"/>
                     </a:xfrm>
                     <a:prstGeom prst="rect">
                       <a:avLst/>
@@ -889,6 +1018,98 @@
           </wp:inline>
         </w:drawing>
       </w:r>
+    </w:p>
+    <w:p>
+      <w:pPr>
+        <w:rPr>
+          <w:rFonts w:eastAsia="Times New Roman"/>
+        </w:rPr>
+      </w:pPr>
+    </w:p>
+    <w:p>
+      <w:pPr>
+        <w:pStyle w:val="Heading3"/>
+        <w:rPr>
+          <w:rFonts w:eastAsia="Times New Roman"/>
+        </w:rPr>
+      </w:pPr>
+      <w:r>
+        <w:rPr>
+          <w:rFonts w:eastAsia="Times New Roman"/>
+        </w:rPr>
+        <w:lastRenderedPageBreak/>
+        <w:t>Page 1 Wireframe</w:t>
+      </w:r>
+    </w:p>
+    <w:p>
+      <w:pPr>
+        <w:rPr>
+          <w:rFonts w:eastAsia="Times New Roman"/>
+        </w:rPr>
+      </w:pPr>
+      <w:r>
+        <w:rPr>
+          <w:rFonts w:eastAsia="Times New Roman"/>
+        </w:rPr>
+        <w:t>[wireframe here]</w:t>
+      </w:r>
+    </w:p>
+    <w:p>
+      <w:pPr>
+        <w:pStyle w:val="Heading3"/>
+        <w:rPr>
+          <w:rFonts w:eastAsia="Times New Roman"/>
+        </w:rPr>
+      </w:pPr>
+    </w:p>
+    <w:p>
+      <w:pPr>
+        <w:pStyle w:val="Heading3"/>
+        <w:rPr>
+          <w:rFonts w:eastAsia="Times New Roman"/>
+        </w:rPr>
+      </w:pPr>
+    </w:p>
+    <w:p>
+      <w:pPr>
+        <w:rPr>
+          <w:rFonts w:eastAsia="Times New Roman"/>
+        </w:rPr>
+      </w:pPr>
+    </w:p>
+    <w:p>
+      <w:pPr>
+        <w:pStyle w:val="Heading3"/>
+        <w:rPr>
+          <w:rFonts w:eastAsia="Times New Roman"/>
+        </w:rPr>
+      </w:pPr>
+      <w:r>
+        <w:rPr>
+          <w:rFonts w:eastAsia="Times New Roman"/>
+        </w:rPr>
+        <w:t>Page 2 Wireframe</w:t>
+      </w:r>
+    </w:p>
+    <w:p>
+      <w:pPr>
+        <w:rPr>
+          <w:rFonts w:eastAsia="Times New Roman"/>
+        </w:rPr>
+      </w:pPr>
+      <w:r>
+        <w:rPr>
+          <w:rFonts w:eastAsia="Times New Roman"/>
+        </w:rPr>
+        <w:t>[wireframe here]</w:t>
+      </w:r>
+    </w:p>
+    <w:p>
+      <w:pPr>
+        <w:rPr>
+          <w:rFonts w:eastAsia="Times New Roman"/>
+        </w:rPr>
+      </w:pPr>
     </w:p>
     <w:sectPr>
       <w:pgSz w:w="12240" w:h="15840"/>
@@ -1292,6 +1513,7 @@
   <w:style w:type="paragraph" w:default="1" w:styleId="Normal">
     <w:name w:val="Normal"/>
     <w:qFormat/>
+    <w:rsid w:val="00850177"/>
     <w:rPr>
       <w:rFonts w:eastAsiaTheme="minorEastAsia"/>
       <w:sz w:val="24"/>
@@ -1429,7 +1651,6 @@
     <w:basedOn w:val="DefaultParagraphFont"/>
     <w:link w:val="Heading3"/>
     <w:uiPriority w:val="9"/>
-    <w:semiHidden/>
     <w:rPr>
       <w:rFonts w:asciiTheme="majorHAnsi" w:eastAsiaTheme="majorEastAsia" w:hAnsiTheme="majorHAnsi" w:cstheme="majorBidi"/>
       <w:color w:val="1F3763" w:themeColor="accent1" w:themeShade="7F"/>

</xml_diff>